<commit_message>
Sales kit: August 2026 refresh — AI governance across all docs, +AI Statement, +DPA
</commit_message>
<xml_diff>
--- a/public/sales-kit/FlowSync_Acuerdo_Maestro_Suscripcion_BORRADOR_ES.docx
+++ b/public/sales-kit/FlowSync_Acuerdo_Maestro_Suscripcion_BORRADOR_ES.docx
@@ -15,7 +15,7 @@
         <w:pStyle w:val="Subtitle"/>
       </w:pPr>
       <w:r>
-        <w:t xml:space="preserve">Acuerdo entre empresas (B2B) — BORRADOR de plantilla · Julio 2026</w:t>
+        <w:t xml:space="preserve">Acuerdo entre empresas (B2B) — BORRADOR de plantilla · Agosto 2026</w:t>
       </w:r>
     </w:p>
     <w:p>
@@ -396,6 +396,24 @@
       </w:pPr>
       <w:r>
         <w:t xml:space="preserve">6.4 Subprocesadores. El Cliente autoriza los subprocesadores listados en el documento de Información Comercial y Seguridad; el Proveedor sigue siendo responsable de su desempeño.</w:t>
+      </w:r>
+    </w:p>
+    <w:p>
+      <w:pPr>
+        <w:pStyle w:val="ListParagraph"/>
+        <w:numPr>
+          <w:ilvl w:val="0"/>
+          <w:numId w:val="2"/>
+        </w:numPr>
+      </w:pPr>
+      <w:r>
+        <w:rPr>
+          <w:b/>
+        </w:rPr>
+        <w:t xml:space="preserve">6.5 Procesamiento con IA.</w:t>
+      </w:r>
+      <w:r>
+        <w:t xml:space="preserve"> El Servicio incluye funciones de IA asistivas procesadas del lado del servidor mediante Anthropic (Claude API). Los Datos del Cliente enviados a funciones de IA no se usan para entrenar modelos. El Cliente puede desactivar todas las funciones de IA de su workspace dentro del Servicio (aplicación del lado del servidor, con registro de auditoría de IA). El subprocesamiento de IA queda cubierto por el DPA una vez suscrito.</w:t>
       </w:r>
     </w:p>
     <w:p>

</xml_diff>